<commit_message>
Update trainer education content with 8/17 evidence-review corrections
Base HTML module and shared trainer-development-program script now
reflect the corrected RIR precision model (2 RIR default for primary
lifts, 3+ RIR collapsed into one band), LIFTMOR's actual >85% 1RM
prescription plus supervision/ramp-in/risk-gate language, and the
corrected context-driven protein targets (1.6-2.2 g/kg, no age-banded
escalation). Rebuilt the 4 dependent .docx Train-the-Trainer programs
so they inherit the fix.
</commit_message>
<xml_diff>
--- a/trainer_education/ICONS_Trainer_Development_Program.docx
+++ b/trainer_education/ICONS_Trainer_Development_Program.docx
@@ -2501,7 +2501,7 @@
           <w:sz w:val="17"/>
           <w:szCs w:val="17"/>
         </w:rPr>
-        <w:t xml:space="preserve">Every work set in this program uses RIR (Reps In Reserve). 2 RIR means you could do 2 more reps with perfect form but choose not to. 1 RIR means one rep left. This is how ACSM 2026 recommends loading — training to failure does not consistently outperform RIR-based loading and increases injury and recovery cost. When you enforce this with clients, you will do so knowing exactly how 1 RIR feels.</w:t>
+        <w:t xml:space="preserve">Every work set in this program uses RIR (Reps In Reserve). 2 RIR — two reps left with clean form — is the DEFAULT proximity for PRIMARY lifts in this program (corrected 8/17/2026: a 2024 dose-response meta-regression found strength gains largely unrelated to estimated RIR, so 1 RIR is not a stronger stimulus than 2 RIR for a primary lift). 1 RIR is reserved for hypertrophy-priority ACCESSORY work, not primary strength sets. Anything above 2 RIR — warm-ups, technique sets, sub-maximal work — is treated as one collapsed "technique/submaximal" band, not a graduated 3-vs-4-vs-5 RIR target, since RIR accuracy degrades the farther a set sits from failure. This is how ACSM 2026 recommends loading — training to failure does not consistently outperform RIR-based loading and increases injury and recovery cost. When you enforce this with clients, you will do so knowing exactly how 2 RIR feels on your own primary lifts.</w:t>
       </w:r>
     </w:p>
     <w:p>
@@ -3781,7 +3781,7 @@
                 <w:sz w:val="14"/>
                 <w:szCs w:val="14"/>
               </w:rPr>
-              <w:t xml:space="preserve">Trainer Insight: −41% groin injury risk (Harøy 2018). Program for every client.</w:t>
+              <w:t xml:space="preserve">Trainer Insight: −41% weekly groin-problem risk, cluster-RCT (Harøy et al. 2019, BJSM). Program for every client.</w:t>
             </w:r>
           </w:p>
         </w:tc>
@@ -4533,7 +4533,7 @@
                 <w:sz w:val="14"/>
                 <w:szCs w:val="14"/>
               </w:rPr>
-              <w:t xml:space="preserve">  1–2 RIR on last set</w:t>
+              <w:t xml:space="preserve">  2 RIR — default proximity for a primary lift</w:t>
             </w:r>
           </w:p>
         </w:tc>
@@ -4786,7 +4786,7 @@
                 <w:sz w:val="14"/>
                 <w:szCs w:val="14"/>
               </w:rPr>
-              <w:t xml:space="preserve">  1–2 RIR</w:t>
+              <w:t xml:space="preserve">  2 RIR</w:t>
             </w:r>
           </w:p>
         </w:tc>
@@ -5583,7 +5583,7 @@
                 <w:sz w:val="14"/>
                 <w:szCs w:val="14"/>
               </w:rPr>
-              <w:t xml:space="preserve">  1–2 RIR</w:t>
+              <w:t xml:space="preserve">  2 RIR — default proximity for a primary lift</w:t>
             </w:r>
           </w:p>
         </w:tc>
@@ -5823,7 +5823,7 @@
                 <w:sz w:val="14"/>
                 <w:szCs w:val="14"/>
               </w:rPr>
-              <w:t xml:space="preserve">  1 RIR on last set</w:t>
+              <w:t xml:space="preserve">  2 RIR</w:t>
             </w:r>
           </w:p>
         </w:tc>
@@ -7694,7 +7694,7 @@
           <w:sz w:val="17"/>
           <w:szCs w:val="17"/>
         </w:rPr>
-        <w:t xml:space="preserve">The hex bar deadlift is the single most important movement in the ICONS system. It builds posterior chain strength, drives bone density (≥80% 1RM per LIFTMOR RCT), trains loaded hip extension, and is safe for a wide range of ages and populations. When you coach this lift, you are delivering a physiological intervention. Load it with that intention. Your working sets today are at 87–92% of your estimated 1RM.</w:t>
+        <w:t xml:space="preserve">The hex bar deadlift is the single most important movement in the ICONS system. It builds posterior chain strength and drives bone density — the LIFTMOR RCT's actual prescription is &gt;85% 1RM (corrected 8/17/2026 from a rounded "≥80%"), delivered supervised, 2×/week, after a technique-first ramp-in and a risk-stratification screen for fracture history. Your working sets today (87–92% Est 1RM) sit inside that real range, not the old rounded-down one. When you coach this lift, you are delivering a physiological intervention. Load it with that intention.</w:t>
       </w:r>
     </w:p>
     <w:tbl>
@@ -12432,7 +12432,7 @@
           <w:sz w:val="17"/>
           <w:szCs w:val="17"/>
         </w:rPr>
-        <w:t xml:space="preserve">The corrective primer on a bilateral lower body day targets knee stability and glute activation. Today's correctives fire the glute medius and VMO — the two muscles most responsible for preventing knee valgus under bilateral loading. This is the corrective protocol your knee-valgus clients receive before every squat session.</w:t>
+        <w:t xml:space="preserve">The corrective primer on a bilateral lower body day targets knee stability and glute activation. Today's correctives fire the glute medius and VMO — the two muscles most responsible for preventing knee valgus under bilateral loading. This is the corrective protocol every client receives before every squat session, full stop — not just clients who screen positive on a single-leg-squat or drop-landing test. CLAUDE.md's corrected ACL/Knee-Valgus standard (8/17/2026) retired the old screen-gate: visual screens can't predict who actually sustains a future non-contact ACL injury, while the circuit itself is strongly evidence-backed at the population level regardless of screen result — so it's dosed for everyone (20–30 min, 1–2×/week) and tracked for ≥76% session-completion adherence, not reserved for clients who 'fail' a screen.</w:t>
       </w:r>
     </w:p>
     <w:tbl>
@@ -12745,7 +12745,7 @@
                 <w:sz w:val="14"/>
                 <w:szCs w:val="14"/>
               </w:rPr>
-              <w:t xml:space="preserve">Trainer Insight: this is exactly what a knee-valgus client gets before loading. Feel why.</w:t>
+              <w:t xml:space="preserve">Trainer Insight: this now runs for every client before loading, not just clients who screen positive for valgus — screens can't predict future ACL injury, but the circuit itself works at the population level regardless. Feel why.</w:t>
             </w:r>
           </w:p>
         </w:tc>

</xml_diff>

<commit_message>
Add scoliosis section and zero-data scope rule; fix RIR narrative drift in trainer programs
</commit_message>
<xml_diff>
--- a/trainer_education/ICONS_Trainer_Development_Program.docx
+++ b/trainer_education/ICONS_Trainer_Development_Program.docx
@@ -2501,7 +2501,7 @@
           <w:sz w:val="17"/>
           <w:szCs w:val="17"/>
         </w:rPr>
-        <w:t xml:space="preserve">Every work set in this program uses RIR (Reps In Reserve). 2 RIR — two reps left with clean form — is the DEFAULT proximity for PRIMARY lifts in this program (corrected 8/17/2026: a 2024 dose-response meta-regression found strength gains largely unrelated to estimated RIR, so 1 RIR is not a stronger stimulus than 2 RIR for a primary lift). 1 RIR is reserved for hypertrophy-priority ACCESSORY work, not primary strength sets. Anything above 2 RIR — warm-ups, technique sets, sub-maximal work — is treated as one collapsed "technique/submaximal" band, not a graduated 3-vs-4-vs-5 RIR target, since RIR accuracy degrades the farther a set sits from failure. This is how ACSM 2026 recommends loading — training to failure does not consistently outperform RIR-based loading and increases injury and recovery cost. When you enforce this with clients, you will do so knowing exactly how 2 RIR feels on your own primary lifts.</w:t>
+        <w:t xml:space="preserve">Every work set in this program uses RIR (Reps In Reserve). 2 RIR — two reps left with clean form — is the DEFAULT proximity for PRIMARY lifts in this program (corrected 8/17/2026: a 2024 dose-response meta-regression found strength gains largely unrelated to estimated RIR, so 1 RIR is not a stronger stimulus than 2 RIR for a primary lift). 1 RIR is reserved for hypertrophy-priority ACCESSORY work, or for a deliberate near-maximal set on a peak-intensity day (Day 2's hex bar deadlift and heavy hip thrust are the only primary lifts in this program that sit there, and only because Day 2 is a 90% day) — it is never the default on a primary strength set. Anything above 2 RIR — warm-ups, technique sets, sub-maximal work — is treated as one collapsed "technique/submaximal" band, not a graduated 3-vs-4-vs-5 RIR target, since RIR accuracy degrades the farther a set sits from failure. This is how ACSM 2026 recommends loading — training to failure does not consistently outperform RIR-based loading and increases injury and recovery cost. When you enforce this with clients, you will do so knowing exactly how 2 RIR feels on your own primary lifts.</w:t>
       </w:r>
     </w:p>
     <w:p>
@@ -7393,7 +7393,7 @@
           <w:sz w:val="17"/>
           <w:szCs w:val="17"/>
         </w:rPr>
-        <w:t xml:space="preserve">DAY 1 DEBRIEF — What to log and reflect on: (1) Where was your 1 RIR? Was it where you thought? (2) Which side felt stronger on the single-arm row? (3) How long did you hold the loaded plank? (4) How did the corrective primer feel compared to how you'd typically start a session? These are the questions you will ask your clients.</w:t>
+        <w:t xml:space="preserve">DAY 1 DEBRIEF — What to log and reflect on: (1) Where was your 2 RIR? Was it where you thought? (2) Which side felt stronger on the single-arm row? (3) How long did you hold the loaded plank? (4) How did the corrective primer feel compared to how you'd typically start a session? These are the questions you will ask your clients.</w:t>
       </w:r>
     </w:p>
     <w:p>

</xml_diff>